<commit_message>
Convert all LaTeX math expressions and subscripts to flat human-readable text
</commit_message>
<xml_diff>
--- a/MotionDNA_Review2_Report.docx
+++ b/MotionDNA_Review2_Report.docx
@@ -59,38 +59,12 @@
     </w:p>
     <w:p>
       <w:r>
-        <w:t>Since Review 1, our team has progressed from preliminary literature review and initial architecture planning into a fully functional software prototype. The codebase is structured as a modular Python package (</w:t>
-      </w:r>
-      <w:r>
-        <w:rPr>
-          <w:rFonts w:ascii="Consolas" w:hAnsi="Consolas"/>
-          <w:sz w:val="20"/>
-        </w:rPr>
-        <w:t>motiondna/</w:t>
-      </w:r>
-      <w:r>
-        <w:t>) delivered through an intuitive Streamlit web dashboard (</w:t>
-      </w:r>
-      <w:r>
-        <w:rPr>
-          <w:rFonts w:ascii="Consolas" w:hAnsi="Consolas"/>
-          <w:sz w:val="20"/>
-        </w:rPr>
-        <w:t>app.py</w:t>
-      </w:r>
-      <w:r>
-        <w:t>). This operationalizes the complete end-to-end processing pipeline originally proposed:</w:t>
+        <w:t>Since Review 1, our team has progressed from preliminary literature review and initial architecture planning into a fully functional software prototype. The codebase is structured as a modular Python package (motiondna/) delivered through an intuitive Streamlit web dashboard (app.py). This operationalizes the complete end-to-end processing pipeline originally proposed:</w:t>
       </w:r>
     </w:p>
     <w:p>
       <w:r>
-        <w:t>$$</w:t>
-      </w:r>
-      <w:r>
-        <w:t>\text{Video/CSV Input} \longrightarrow \text{Landmark Extraction} \longrightarrow \text{Knee Kinematics} \longrightarrow \text{Rule-Based Risk Screening} \longrightarrow \text{Interactive Dashboard \&amp; CSV Export}</w:t>
-      </w:r>
-      <w:r>
-        <w:t>$$</w:t>
+        <w:t>Video/CSV Input -&gt; Landmark Extraction -&gt; Knee Kinematics -&gt; Rule-Based Risk Screening -&gt; Interactive Dashboard &amp; CSV Export</w:t>
       </w:r>
     </w:p>
     <w:p>
@@ -109,22 +83,12 @@
         <w:rPr>
           <w:b/>
         </w:rPr>
-        <w:t>`app.py` (User Interface &amp; Interactive Inspector):</w:t>
+        <w:t>app.py (User Interface &amp; Interactive Inspector):</w:t>
       </w:r>
     </w:p>
     <w:p>
       <w:r>
-        <w:t xml:space="preserve">Serves as the primary entry point for end users. Beyond accepting CSV coordinate files or raw video uploads, running the analysis pipeline, and displaying overall risk metrics, </w:t>
-      </w:r>
-      <w:r>
-        <w:rPr>
-          <w:rFonts w:ascii="Consolas" w:hAnsi="Consolas"/>
-          <w:sz w:val="20"/>
-        </w:rPr>
-        <w:t>app.py</w:t>
-      </w:r>
-      <w:r>
-        <w:t xml:space="preserve"> now includes an </w:t>
+        <w:t xml:space="preserve">Serves as the primary entry point for end users. Beyond accepting CSV coordinate files or raw video uploads, running the analysis pipeline, and displaying overall risk metrics, app.py now includes an </w:t>
       </w:r>
       <w:r>
         <w:rPr>
@@ -144,22 +108,12 @@
         <w:rPr>
           <w:b/>
         </w:rPr>
-        <w:t>`motiondna/pose.py` (Pose Estimation &amp; Overlay Generation):</w:t>
+        <w:t>motiondna/pose.py (Pose Estimation &amp; Overlay Generation):</w:t>
       </w:r>
     </w:p>
     <w:p>
       <w:r>
-        <w:t xml:space="preserve">Uses Google’s MediaPipe Pose model to detect lower-limb joint coordinates (hips, knees, and ankles) across video frames. During extraction, it scales raw relative coordinates using an estimated participant height to approximate metric distances. Crucially, </w:t>
-      </w:r>
-      <w:r>
-        <w:rPr>
-          <w:rFonts w:ascii="Consolas" w:hAnsi="Consolas"/>
-          <w:sz w:val="20"/>
-        </w:rPr>
-        <w:t>pose.py</w:t>
-      </w:r>
-      <w:r>
-        <w:t xml:space="preserve"> now retains full-sequence, pose-annotated image frames with color-coded lower-limb skeleton overlays, allowing users to visually cross-verify tracking quality for every frame.</w:t>
+        <w:t>Uses Google’s MediaPipe Pose model to detect lower-limb joint coordinates (hips, knees, and ankles) across video frames. During extraction, it scales raw relative coordinates using an estimated participant height to approximate metric distances. Crucially, pose.py now retains full-sequence, pose-annotated image frames with color-coded lower-limb skeleton overlays, allowing users to visually cross-verify tracking quality for every frame.</w:t>
       </w:r>
     </w:p>
     <w:p>
@@ -170,24 +124,12 @@
         <w:rPr>
           <w:b/>
         </w:rPr>
-        <w:t>`motiondna/kinematics.py` (Calculation Core):</w:t>
+        <w:t>motiondna/kinematics.py (Calculation Core):</w:t>
       </w:r>
     </w:p>
     <w:p>
       <w:r>
-        <w:t>The mathematical core of MotionDNA. It computes 3D vector-based knee flexion angles (</w:t>
-      </w:r>
-      <w:r>
-        <w:t>$\theta_{\text{flexion}} = 180^\circ - \theta_{\text{included}}$</w:t>
-      </w:r>
-      <w:r>
-        <w:t>), calculates numerical angular velocities (</w:t>
-      </w:r>
-      <w:r>
-        <w:t>$\Delta \theta / \Delta t$</w:t>
-      </w:r>
-      <w:r>
-        <w:t>), and measures horizontal knee-to-ankle offsets as a proxy for dynamic knee valgus. It also includes a synthetic squat and drop-jump generator for benchmarking while physical data collection is underway.</w:t>
+        <w:t>The mathematical core of MotionDNA. It computes 3D vector-based knee flexion angles (Knee Flexion Angle = 180 degrees - Included Joint Angle), calculates numerical angular velocities (Change in Angle / Change in Time), and measures horizontal knee-to-ankle offsets as a proxy for dynamic knee valgus. It also includes a synthetic squat and drop-jump generator for benchmarking while physical data collection is underway.</w:t>
       </w:r>
     </w:p>
     <w:p>
@@ -198,66 +140,12 @@
         <w:rPr>
           <w:b/>
         </w:rPr>
-        <w:t>`motiondna/risk.py` (Rule-Based Screening Engine):</w:t>
+        <w:t>motiondna/risk.py (Rule-Based Screening Engine):</w:t>
       </w:r>
     </w:p>
     <w:p>
       <w:r>
-        <w:t>Implements a transparent, fully explainable 0–100 risk scoring algorithm rather than an opaque black-box ML model. Risk points accumulate based on shallow squat/landing depth, bilateral flexion asymmetry (</w:t>
-      </w:r>
-      <w:r>
-        <w:t>$&gt;12^\circ$</w:t>
-      </w:r>
-      <w:r>
-        <w:t>), excessive knee-ankle offset (</w:t>
-      </w:r>
-      <w:r>
-        <w:t>$&gt;4\text{ cm}$</w:t>
-      </w:r>
-      <w:r>
-        <w:t>), and high angular velocity (</w:t>
-      </w:r>
-      <w:r>
-        <w:t>$&gt;500^\circ/\text{s}$</w:t>
-      </w:r>
-      <w:r>
-        <w:t>). Results map to clear risk bands (</w:t>
-      </w:r>
-      <w:r>
-        <w:rPr>
-          <w:i/>
-        </w:rPr>
-        <w:t>Lower</w:t>
-      </w:r>
-      <w:r>
-        <w:t xml:space="preserve">, </w:t>
-      </w:r>
-      <w:r>
-        <w:rPr>
-          <w:i/>
-        </w:rPr>
-        <w:t>Moderate</w:t>
-      </w:r>
-      <w:r>
-        <w:t xml:space="preserve">, </w:t>
-      </w:r>
-      <w:r>
-        <w:rPr>
-          <w:i/>
-        </w:rPr>
-        <w:t>Elevated</w:t>
-      </w:r>
-      <w:r>
-        <w:t xml:space="preserve">) accompanied by plain-language clinical observations explaining </w:t>
-      </w:r>
-      <w:r>
-        <w:rPr>
-          <w:i/>
-        </w:rPr>
-        <w:t>why</w:t>
-      </w:r>
-      <w:r>
-        <w:t xml:space="preserve"> a score was given.</w:t>
+        <w:t>Implements a transparent, fully explainable 0 to 100 risk scoring algorithm rather than an opaque black-box ML model. Risk points accumulate based on shallow squat/landing depth, bilateral flexion asymmetry (greater than 12 degrees), excessive knee-ankle offset (greater than 4 cm), and high angular velocity (greater than 500 degrees/second). Results map to clear risk bands (Lower, Moderate, Elevated) accompanied by plain-language clinical observations explaining why a score was given.</w:t>
       </w:r>
     </w:p>
     <w:p>
@@ -268,42 +156,12 @@
         <w:rPr>
           <w:b/>
         </w:rPr>
-        <w:t>`motiondna/__init__.py`:</w:t>
+        <w:t>motiondna/__init__.py:</w:t>
       </w:r>
     </w:p>
     <w:p>
       <w:r>
-        <w:t>Exposes key package functions (</w:t>
-      </w:r>
-      <w:r>
-        <w:rPr>
-          <w:rFonts w:ascii="Consolas" w:hAnsi="Consolas"/>
-          <w:sz w:val="20"/>
-        </w:rPr>
-        <w:t>analyze_landmarks</w:t>
-      </w:r>
-      <w:r>
-        <w:t xml:space="preserve">, </w:t>
-      </w:r>
-      <w:r>
-        <w:rPr>
-          <w:rFonts w:ascii="Consolas" w:hAnsi="Consolas"/>
-          <w:sz w:val="20"/>
-        </w:rPr>
-        <w:t>make_demo_trial</w:t>
-      </w:r>
-      <w:r>
-        <w:t xml:space="preserve">, </w:t>
-      </w:r>
-      <w:r>
-        <w:rPr>
-          <w:rFonts w:ascii="Consolas" w:hAnsi="Consolas"/>
-          <w:sz w:val="20"/>
-        </w:rPr>
-        <w:t>score_movement_risk</w:t>
-      </w:r>
-      <w:r>
-        <w:t>) for clean imports.</w:t>
+        <w:t>Exposes key package functions (analyze_landmarks, make_demo_trial, score_movement_risk) for clean imports.</w:t>
       </w:r>
     </w:p>
     <w:p>
@@ -314,52 +172,12 @@
         <w:rPr>
           <w:b/>
         </w:rPr>
-        <w:t>`requirements.txt`, `packages.txt`, `runtime.txt`, `README.md`:</w:t>
+        <w:t>requirements.txt, packages.txt, runtime.txt, README.md:</w:t>
       </w:r>
     </w:p>
     <w:p>
       <w:r>
-        <w:t>Documents project dependencies, setup commands, CSV schemas, and system-level Linux dependencies (</w:t>
-      </w:r>
-      <w:r>
-        <w:rPr>
-          <w:rFonts w:ascii="Consolas" w:hAnsi="Consolas"/>
-          <w:sz w:val="20"/>
-        </w:rPr>
-        <w:t>libgl1</w:t>
-      </w:r>
-      <w:r>
-        <w:t xml:space="preserve">, </w:t>
-      </w:r>
-      <w:r>
-        <w:rPr>
-          <w:rFonts w:ascii="Consolas" w:hAnsi="Consolas"/>
-          <w:sz w:val="20"/>
-        </w:rPr>
-        <w:t>libegl1</w:t>
-      </w:r>
-      <w:r>
-        <w:t xml:space="preserve">, </w:t>
-      </w:r>
-      <w:r>
-        <w:rPr>
-          <w:rFonts w:ascii="Consolas" w:hAnsi="Consolas"/>
-          <w:sz w:val="20"/>
-        </w:rPr>
-        <w:t>libgles2</w:t>
-      </w:r>
-      <w:r>
-        <w:t xml:space="preserve">, </w:t>
-      </w:r>
-      <w:r>
-        <w:rPr>
-          <w:rFonts w:ascii="Consolas" w:hAnsi="Consolas"/>
-          <w:sz w:val="20"/>
-        </w:rPr>
-        <w:t>libglib2.0-0</w:t>
-      </w:r>
-      <w:r>
-        <w:t>) required for headless deployment on Streamlit Community Cloud.</w:t>
+        <w:t>Documents project dependencies, setup commands, CSV schemas, and system-level Linux dependencies (libgl1, libegl1, libgles2, libglib2.0-0) required for headless deployment on Streamlit Community Cloud.</w:t>
       </w:r>
     </w:p>
     <w:p>
@@ -398,17 +216,7 @@
         <w:t>Objective 1</w:t>
       </w:r>
       <w:r>
-        <w:t xml:space="preserve"> (pose estimation pipeline) is realized in </w:t>
-      </w:r>
-      <w:r>
-        <w:rPr>
-          <w:rFonts w:ascii="Consolas" w:hAnsi="Consolas"/>
-          <w:sz w:val="20"/>
-        </w:rPr>
-        <w:t>pose.py</w:t>
-      </w:r>
-      <w:r>
-        <w:t xml:space="preserve">, while </w:t>
+        <w:t xml:space="preserve"> (pose estimation pipeline) is realized in pose.py, while </w:t>
       </w:r>
       <w:r>
         <w:rPr>
@@ -417,37 +225,7 @@
         <w:t>Objective 2</w:t>
       </w:r>
       <w:r>
-        <w:t xml:space="preserve"> (kinematic calculations, explainable risk scoring, and interactive frame inspection) is realized in </w:t>
-      </w:r>
-      <w:r>
-        <w:rPr>
-          <w:rFonts w:ascii="Consolas" w:hAnsi="Consolas"/>
-          <w:sz w:val="20"/>
-        </w:rPr>
-        <w:t>kinematics.py</w:t>
-      </w:r>
-      <w:r>
-        <w:t xml:space="preserve">, </w:t>
-      </w:r>
-      <w:r>
-        <w:rPr>
-          <w:rFonts w:ascii="Consolas" w:hAnsi="Consolas"/>
-          <w:sz w:val="20"/>
-        </w:rPr>
-        <w:t>risk.py</w:t>
-      </w:r>
-      <w:r>
-        <w:t xml:space="preserve">, and </w:t>
-      </w:r>
-      <w:r>
-        <w:rPr>
-          <w:rFonts w:ascii="Consolas" w:hAnsi="Consolas"/>
-          <w:sz w:val="20"/>
-        </w:rPr>
-        <w:t>app.py</w:t>
-      </w:r>
-      <w:r>
-        <w:t>.</w:t>
+        <w:t xml:space="preserve"> (kinematic calculations, explainable risk scoring, and interactive frame inspection) is realized in kinematics.py, risk.py, and app.py.</w:t>
       </w:r>
     </w:p>
     <w:p>
@@ -496,7 +274,7 @@
         <w:rPr>
           <w:b/>
         </w:rPr>
-        <w:t>over \$2.1 trillion USD</w:t>
+        <w:t>over $2.1 trillion USD</w:t>
       </w:r>
       <w:r>
         <w:t xml:space="preserve"> (1.41% of global GDP). In sports and athletics, lower-limb ligament injuries—particularly anterior cruciate ligament (ACL) tears—remain a severe concern, with an average incidence of roughly 1 in 3,500 in general athletic populations, and significantly higher rates among female field-sport athletes.</w:t>
@@ -616,13 +394,7 @@
         <w:t>Theia3D:</w:t>
       </w:r>
       <w:r>
-        <w:t xml:space="preserve"> Uses synchronized multi-camera setups and deep learning to achieve high kinematic precision (reported sagittal plane RMSE of </w:t>
-      </w:r>
-      <w:r>
-        <w:t>$3.2^\circ \text{--} 15.7^\circ$</w:t>
-      </w:r>
-      <w:r>
-        <w:t xml:space="preserve"> against Vicon). However, it requires expensive camera arrays and dedicated processing hardware, reintroducing high cost and complexity.</w:t>
+        <w:t xml:space="preserve"> Uses synchronized multi-camera setups and deep learning to achieve high kinematic precision (reported sagittal plane RMSE of 3.2 degrees to 15.7 degrees against Vicon). However, it requires expensive camera arrays and dedicated processing hardware, reintroducing high cost and complexity.</w:t>
       </w:r>
     </w:p>
     <w:p>
@@ -636,13 +408,7 @@
         <w:t>OpenCap (Stanford University):</w:t>
       </w:r>
       <w:r>
-        <w:t xml:space="preserve"> A free, smartphone-based multi-camera platform for gait and movement analysis. While closer to MotionDNA's goals, published validation studies note clinically meaningful errors in certain planes (e.g., sagittal hip-angle errors exceeding </w:t>
-      </w:r>
-      <w:r>
-        <w:t>$10^\circ$</w:t>
-      </w:r>
-      <w:r>
-        <w:t>), which can limit screening accuracy for ACL-related hip/trunk control.</w:t>
+        <w:t xml:space="preserve"> A free, smartphone-based multi-camera platform for gait and movement analysis. While closer to MotionDNA's goals, published validation studies note clinically meaningful errors in certain planes (for example, sagittal hip-angle errors exceeding 10 degrees), which can limit screening accuracy for ACL-related hip/trunk control.</w:t>
       </w:r>
     </w:p>
     <w:p>
@@ -719,17 +485,7 @@
         <w:t>Backend Processing:</w:t>
       </w:r>
       <w:r>
-        <w:t xml:space="preserve"> Modular Python (</w:t>
-      </w:r>
-      <w:r>
-        <w:rPr>
-          <w:rFonts w:ascii="Consolas" w:hAnsi="Consolas"/>
-          <w:sz w:val="20"/>
-        </w:rPr>
-        <w:t>motiondna/</w:t>
-      </w:r>
-      <w:r>
-        <w:t>) separating pose extraction, kinematic calculations, and risk heuristics into clean, testable modules.</w:t>
+        <w:t xml:space="preserve"> Modular Python (motiondna/) separating pose extraction, kinematic calculations, and risk heuristics into clean, testable modules.</w:t>
       </w:r>
     </w:p>
     <w:p>
@@ -757,37 +513,7 @@
         <w:t>Data Interoperability:</w:t>
       </w:r>
       <w:r>
-        <w:t xml:space="preserve"> Support for raw video uploads (</w:t>
-      </w:r>
-      <w:r>
-        <w:rPr>
-          <w:rFonts w:ascii="Consolas" w:hAnsi="Consolas"/>
-          <w:sz w:val="20"/>
-        </w:rPr>
-        <w:t>.mp4</w:t>
-      </w:r>
-      <w:r>
-        <w:t xml:space="preserve">, </w:t>
-      </w:r>
-      <w:r>
-        <w:rPr>
-          <w:rFonts w:ascii="Consolas" w:hAnsi="Consolas"/>
-          <w:sz w:val="20"/>
-        </w:rPr>
-        <w:t>.mov</w:t>
-      </w:r>
-      <w:r>
-        <w:t xml:space="preserve">, </w:t>
-      </w:r>
-      <w:r>
-        <w:rPr>
-          <w:rFonts w:ascii="Consolas" w:hAnsi="Consolas"/>
-          <w:sz w:val="20"/>
-        </w:rPr>
-        <w:t>.avi</w:t>
-      </w:r>
-      <w:r>
-        <w:t>) and direct CSV landmark import/export.</w:t>
+        <w:t xml:space="preserve"> Support for raw video uploads (.mp4, .mov, .avi) and direct CSV landmark import/export.</w:t>
       </w:r>
     </w:p>
     <w:p>
@@ -801,38 +527,74 @@
     <w:p>
       <w:r>
         <w:rPr>
-          <w:i/>
-          <w:color w:val="646464"/>
+          <w:rFonts w:ascii="Consolas" w:hAnsi="Consolas"/>
+          <w:sz w:val="20"/>
         </w:rPr>
-        <w:t>$$\begin{aligned}</w:t>
+      </w:r>
+      <w:r>
+        <w:rPr>
+          <w:rFonts w:ascii="Consolas" w:hAnsi="Consolas"/>
+          <w:sz w:val="20"/>
+        </w:rPr>
       </w:r>
     </w:p>
     <w:p>
       <w:r>
-        <w:t>\text{[Video / CSV Input]} &amp;\longrightarrow \text{[\texttt{pose.py} MediaPipe Keypoint Tracking \&amp; Annotated Frame Capture]} \\</w:t>
+        <w:t>[Video or Landmark CSV Input]</w:t>
       </w:r>
     </w:p>
     <w:p>
       <w:r>
-        <w:t>&amp;\longrightarrow \text{[\texttt{kinematics.py} Joint Angle, Velocity, \&amp; Offset Calculations]} \\</w:t>
+        <w:t>↓</w:t>
       </w:r>
     </w:p>
     <w:p>
       <w:r>
-        <w:t>&amp;\longrightarrow \text{[\texttt{risk.py} Transparent Heuristic Rule Scoring Engine]} \\</w:t>
+        <w:t>[pose.py] → MediaPipe Pose extracts hip/knee/ankle landmarks per frame</w:t>
       </w:r>
     </w:p>
     <w:p>
       <w:r>
-        <w:t>&amp;\longrightarrow \text{[\texttt{app.py} Dashboard: Metrics, Line Plots, Frame Inspector, CSV Export]}</w:t>
+        <w:t>↓ (scaled using participant height estimate)</w:t>
       </w:r>
     </w:p>
     <w:p>
       <w:r>
-        <w:t>\end{aligned}</w:t>
+        <w:t>[kinematics.py] → Validates data → computes knee flexion angle, angular velocity, knee-to-ankle horizontal offset</w:t>
+      </w:r>
+    </w:p>
+    <w:p>
+      <w:r>
+        <w:t>↓</w:t>
+      </w:r>
+    </w:p>
+    <w:p>
+      <w:r>
+        <w:t>[risk.py] → Rule-based scoring: flexion depth, L/R asymmetry, knee-ankle offset, angular velocity → composite 0 to 100 score + risk band</w:t>
+      </w:r>
+    </w:p>
+    <w:p>
+      <w:r>
+        <w:t>↓</w:t>
+      </w:r>
+    </w:p>
+    <w:p>
+      <w:r>
+        <w:t>[app.py] → Streamlit dashboard: interactive frame inspector (pose overlays + synchronized timeline cursor), knee-flexion plots, summary metrics, readable findings, CSV export</w:t>
+      </w:r>
+    </w:p>
+    <w:p>
+      <w:r>
+        <w:rPr>
+          <w:rFonts w:ascii="Consolas" w:hAnsi="Consolas"/>
+          <w:sz w:val="20"/>
+        </w:rPr>
       </w:r>
       <w:r>
-        <w:t>$$</w:t>
+        <w:rPr>
+          <w:rFonts w:ascii="Consolas" w:hAnsi="Consolas"/>
+          <w:sz w:val="20"/>
+        </w:rPr>
       </w:r>
     </w:p>
     <w:p>
@@ -845,13 +607,7 @@
     </w:p>
     <w:p>
       <w:r>
-        <w:t>The risk engine uses transparent rules so every point added to the composite score (</w:t>
-      </w:r>
-      <w:r>
-        <w:t>$0 \text{--} 100$</w:t>
-      </w:r>
-      <w:r>
-        <w:t>) traces directly back to an observable biomechanical factor:</w:t>
+        <w:t>The risk engine uses transparent rules so every point added to the composite score (0 to 100) traces directly back to an observable biomechanical factor:</w:t>
       </w:r>
     </w:p>
     <w:p>
@@ -865,19 +621,7 @@
         <w:t>Flexion Depth:</w:t>
       </w:r>
       <w:r>
-        <w:t xml:space="preserve"> Points added for shallow squatting (</w:t>
-      </w:r>
-      <w:r>
-        <w:t>$&lt;70^\circ$</w:t>
-      </w:r>
-      <w:r>
-        <w:t>) or landing (</w:t>
-      </w:r>
-      <w:r>
-        <w:t>$&lt;35^\circ$</w:t>
-      </w:r>
-      <w:r>
-        <w:t>).</w:t>
+        <w:t xml:space="preserve"> Points added for shallow squatting (less than 70 degrees) or landing (less than 35 degrees).</w:t>
       </w:r>
     </w:p>
     <w:p>
@@ -891,13 +635,7 @@
         <w:t>Side-to-Side Symmetry:</w:t>
       </w:r>
       <w:r>
-        <w:t xml:space="preserve"> Points added if left/right knee flexion difference exceeds </w:t>
-      </w:r>
-      <w:r>
-        <w:t>$12^\circ$</w:t>
-      </w:r>
-      <w:r>
-        <w:t>.</w:t>
+        <w:t xml:space="preserve"> Points added if left/right knee flexion difference exceeds 12 degrees.</w:t>
       </w:r>
     </w:p>
     <w:p>
@@ -911,13 +649,7 @@
         <w:t>Knee–Ankle Alignment Proxy:</w:t>
       </w:r>
       <w:r>
-        <w:t xml:space="preserve"> Points added if horizontal knee-to-ankle medial offset exceeds </w:t>
-      </w:r>
-      <w:r>
-        <w:t>$4\text{ cm}$</w:t>
-      </w:r>
-      <w:r>
-        <w:t xml:space="preserve"> (dynamic valgus proxy).</w:t>
+        <w:t xml:space="preserve"> Points added if horizontal knee-to-ankle medial offset exceeds 4 cm (dynamic valgus proxy).</w:t>
       </w:r>
     </w:p>
     <w:p>
@@ -931,13 +663,7 @@
         <w:t>Angular Velocity:</w:t>
       </w:r>
       <w:r>
-        <w:t xml:space="preserve"> Points added if peak landing velocity exceeds </w:t>
-      </w:r>
-      <w:r>
-        <w:t>$500^\circ/\text{s}$</w:t>
-      </w:r>
-      <w:r>
-        <w:t>.</w:t>
+        <w:t xml:space="preserve"> Points added if peak landing velocity exceeds 500 degrees/second.</w:t>
       </w:r>
     </w:p>
     <w:p>
@@ -951,7 +677,7 @@
         <w:t>Frame-by-Frame Inspector</w:t>
       </w:r>
       <w:r>
-        <w:t>. Users can drag a timeline slider to freeze the movement at critical moments (e.g., maximum squat depth or initial landing contact). As the slider moves:</w:t>
+        <w:t>. Users can drag a timeline slider to freeze the movement at critical moments (such as maximum squat depth or initial landing contact). As the slider moves:</w:t>
       </w:r>
     </w:p>
     <w:p>
@@ -1013,17 +739,7 @@
     </w:p>
     <w:p>
       <w:r>
-        <w:t xml:space="preserve">The pipeline has been validated end-to-end using synthetic squat and drop-jump trials generated in </w:t>
-      </w:r>
-      <w:r>
-        <w:rPr>
-          <w:rFonts w:ascii="Consolas" w:hAnsi="Consolas"/>
-          <w:sz w:val="20"/>
-        </w:rPr>
-        <w:t>kinematics.py</w:t>
-      </w:r>
-      <w:r>
-        <w:t>, confirming internal mathematical consistency (e.g., higher asymmetry directly scales the composite risk score). As real participant data collection gets underway in the coming weeks, the following outcomes are expected:</w:t>
+        <w:t>The pipeline has been validated end-to-end using synthetic squat and drop-jump trials generated in kinematics.py, confirming internal mathematical consistency (for example, higher asymmetry directly scales the composite risk score). As real participant data collection gets underway in the coming weeks, the following outcomes are expected:</w:t>
       </w:r>
     </w:p>
     <w:p>
@@ -1065,7 +781,7 @@
         <w:t>Error Quantification:</w:t>
       </w:r>
       <w:r>
-        <w:t xml:space="preserve"> Quantified accuracy metrics (e.g., RMSE) benchmarking MotionDNA's single-camera output against reference video analysis.</w:t>
+        <w:t xml:space="preserve"> Quantified accuracy metrics (such as RMSE) benchmarking MotionDNA's single-camera output against reference video analysis.</w:t>
       </w:r>
     </w:p>
     <w:p>

</xml_diff>